<commit_message>
Revise Chapter 5 Rework reflex zones
</commit_message>
<xml_diff>
--- a/public/Chapter-5 Rework/Chapitre_5_REWORK_section_14_alignee_4_niveaux.docx
+++ b/public/Chapter-5 Rework/Chapitre_5_REWORK_section_14_alignee_4_niveaux.docx
@@ -3496,10 +3496,31 @@
             <w:r>
               <w:rPr>
                 <w:b/>
+                <w:lang w:val="fr-FR"/>
               </w:rPr>
               <w:t>SÉQUENCE SYNTHÉTIQUE</w:t>
+            </w:r>
+            <w:r>
+              <w:rPr>
+                <w:b/>
+                <w:lang w:val="fr-FR"/>
+              </w:rPr>
               <w:br/>
-              <w:t>1. Diminuer la persistance du signal d’alarme → 2. Réduire la mobilisation devenue inutile → 3. Libérer les contraintes qui entretiennent le signal → 4. Permettre le retour de la fonction concernée.</w:t>
+              <w:t xml:space="preserve">1. Diminuer la persistance du signal d’alarme → 2. Réduire la mobilisation devenue inutile → 3. Libérer les contraintes qui entretiennent le signal → 4. </w:t>
+            </w:r>
+            <w:proofErr w:type="spellStart"/>
+            <w:r>
+              <w:rPr>
+                <w:b/>
+              </w:rPr>
+              <w:t>Permettre</w:t>
+            </w:r>
+            <w:proofErr w:type="spellEnd"/>
+            <w:r>
+              <w:rPr>
+                <w:b/>
+              </w:rPr>
+              <w:t xml:space="preserve"> le retour de la fonction concernée.</w:t>
             </w:r>
           </w:p>
         </w:tc>
@@ -3508,158 +3529,260 @@
     <w:p>
       <w:pPr>
         <w:pStyle w:val="Heading1"/>
-      </w:pPr>
-      <w:r>
+        <w:rPr>
+          <w:lang w:val="fr-FR"/>
+        </w:rPr>
+      </w:pPr>
+      <w:r>
+        <w:rPr>
+          <w:lang w:val="fr-FR"/>
+        </w:rPr>
         <w:t>14. La progression clinique ROP en quatre niveaux</w:t>
       </w:r>
     </w:p>
     <w:p>
       <w:pPr>
         <w:pStyle w:val="BodyText"/>
-      </w:pPr>
-      <w:r>
+        <w:rPr>
+          <w:lang w:val="fr-FR"/>
+        </w:rPr>
+      </w:pPr>
+      <w:r>
+        <w:rPr>
+          <w:lang w:val="fr-FR"/>
+        </w:rPr>
         <w:t>La séance ROP peut être organisée selon une progression anatomique et fonctionnelle en quatre niveaux : régulation centrale ; préparation du terrain d’adaptation ; interfaces loco-régionales ; cible viscérale ou fonctionnelle spécifique.</w:t>
       </w:r>
     </w:p>
     <w:p>
       <w:pPr>
         <w:pStyle w:val="BodyText"/>
-      </w:pPr>
-      <w:r>
+        <w:rPr>
+          <w:lang w:val="fr-FR"/>
+        </w:rPr>
+      </w:pPr>
+      <w:r>
+        <w:rPr>
+          <w:lang w:val="fr-FR"/>
+        </w:rPr>
         <w:t>Cette progression ne décrit ni une causalité anatomique directe ni un ordre obligatoire. Elle constitue une trame clinique adaptable au motif de consultation, à l’anamnèse, aux tests, au stade d’adaptation et à la tolérance du patient.</w:t>
       </w:r>
     </w:p>
     <w:p>
       <w:pPr>
         <w:pStyle w:val="BodyText"/>
-      </w:pPr>
-      <w:r>
+        <w:rPr>
+          <w:lang w:val="fr-FR"/>
+        </w:rPr>
+      </w:pPr>
+      <w:r>
+        <w:rPr>
+          <w:lang w:val="fr-FR"/>
+        </w:rPr>
         <w:t>L’intérêt de cette organisation est de relier deux lectures complémentaires : où intervient le praticien — centres de régulation, voies autonomes, interfaces régionales, organe ou fonction cible — et ce qu’il cherche à favoriser — diminuer la persistance du signal, accompagner le retrait d’une mobilisation devenue inutile, réduire les contraintes qui entretiennent ce signal, puis permettre le retour de la fonction concernée.</w:t>
       </w:r>
     </w:p>
     <w:p>
       <w:pPr>
         <w:pStyle w:val="BodyText"/>
-      </w:pPr>
-      <w:r>
+        <w:rPr>
+          <w:lang w:val="fr-FR"/>
+        </w:rPr>
+      </w:pPr>
+      <w:r>
+        <w:rPr>
+          <w:lang w:val="fr-FR"/>
+        </w:rPr>
         <w:t>La séance ne consiste donc pas à multiplier les zones. Elle cherche à sélectionner le niveau prioritaire, à apporter une information sensorielle dosée, puis à laisser au patient le temps de l’intégrer.</w:t>
       </w:r>
     </w:p>
     <w:p>
       <w:pPr>
         <w:pStyle w:val="Heading2"/>
-      </w:pPr>
-      <w:r>
+        <w:rPr>
+          <w:lang w:val="fr-FR"/>
+        </w:rPr>
+      </w:pPr>
+      <w:r>
+        <w:rPr>
+          <w:lang w:val="fr-FR"/>
+        </w:rPr>
+        <w:lastRenderedPageBreak/>
         <w:t>14.1. Niveau 1 — Régulation centrale : diminuer la persistance du signal d’alarme</w:t>
       </w:r>
     </w:p>
     <w:p>
       <w:pPr>
         <w:pStyle w:val="BodyText"/>
-      </w:pPr>
-      <w:r>
+        <w:rPr>
+          <w:lang w:val="fr-FR"/>
+        </w:rPr>
+      </w:pPr>
+      <w:r>
+        <w:rPr>
+          <w:lang w:val="fr-FR"/>
+        </w:rPr>
         <w:t>Le premier niveau concerne les structures de régulation centrale et leur environnement neuro-méningé. Dans le modèle clinique ROP, il comprend notamment les zones occipitales, la charnière crânio-cervicale, le tronc cérébral, certains nerfs crâniens ainsi que les repères attribués au diencéphale et aux réseaux émotionnels.</w:t>
       </w:r>
     </w:p>
     <w:p>
       <w:pPr>
         <w:pStyle w:val="BodyText"/>
-      </w:pPr>
-      <w:r>
+        <w:rPr>
+          <w:lang w:val="fr-FR"/>
+        </w:rPr>
+      </w:pPr>
+      <w:r>
+        <w:rPr>
+          <w:lang w:val="fr-FR"/>
+        </w:rPr>
         <w:t>L’objectif n’est pas de « traiter le cerveau » ni de prétendre agir directement sur une structure cérébrale déterminée. Il est d’offrir une expérience tactile stable, prévisible et suffisamment mesurée pour ne pas renforcer la vigilance corporelle.</w:t>
       </w:r>
     </w:p>
     <w:p>
       <w:pPr>
         <w:pStyle w:val="ListBullet"/>
+        <w:rPr>
+          <w:lang w:val="fr-FR"/>
+        </w:rPr>
       </w:pPr>
       <w:r>
         <w:rPr>
           <w:b/>
+          <w:lang w:val="fr-FR"/>
         </w:rPr>
         <w:t>Repères ROP possibles :</w:t>
       </w:r>
       <w:r>
+        <w:rPr>
+          <w:lang w:val="fr-FR"/>
+        </w:rPr>
         <w:t xml:space="preserve"> zones occipitales ; occiput–C1–C2 ; tronc cérébral ; foramen magnum ; foramen jugulaire ; nerfs V, IX, X, XI et XII ; repères attribués au système limbique, au diencéphale et à l’hypophyse ; environnement neuro-méningé associé.</w:t>
       </w:r>
     </w:p>
     <w:p>
       <w:pPr>
         <w:pStyle w:val="ListBullet"/>
+        <w:rPr>
+          <w:lang w:val="fr-FR"/>
+        </w:rPr>
       </w:pPr>
       <w:r>
         <w:rPr>
           <w:b/>
+          <w:lang w:val="fr-FR"/>
         </w:rPr>
         <w:t>Objectif clinique :</w:t>
       </w:r>
       <w:r>
+        <w:rPr>
+          <w:lang w:val="fr-FR"/>
+        </w:rPr>
         <w:t xml:space="preserve"> réduire la vigilance tissulaire et offrir des signaux tactiles compatibles avec un cadre de sécurité.</w:t>
       </w:r>
     </w:p>
     <w:p>
       <w:pPr>
         <w:pStyle w:val="ListBullet"/>
+        <w:rPr>
+          <w:lang w:val="fr-FR"/>
+        </w:rPr>
       </w:pPr>
       <w:r>
         <w:rPr>
           <w:b/>
+          <w:lang w:val="fr-FR"/>
         </w:rPr>
         <w:t>Lecture anatomique :</w:t>
       </w:r>
       <w:r>
+        <w:rPr>
+          <w:lang w:val="fr-FR"/>
+        </w:rPr>
         <w:t xml:space="preserve"> ce niveau correspond au système nerveux central, premier étage du raisonnement clinique développé dans l’ouvrage.</w:t>
       </w:r>
     </w:p>
     <w:p>
       <w:pPr>
         <w:pStyle w:val="ListBullet"/>
+        <w:rPr>
+          <w:lang w:val="fr-FR"/>
+        </w:rPr>
       </w:pPr>
       <w:r>
         <w:rPr>
           <w:b/>
+          <w:lang w:val="fr-FR"/>
         </w:rPr>
         <w:t>Limite :</w:t>
       </w:r>
       <w:r>
+        <w:rPr>
+          <w:lang w:val="fr-FR"/>
+        </w:rPr>
         <w:t xml:space="preserve"> la ROP ne traite pas directement l’amygdale, l’hypothalamus ou le cortex comme des structures accessibles à la palpation.</w:t>
       </w:r>
     </w:p>
     <w:p>
       <w:pPr>
         <w:pStyle w:val="Heading2"/>
-      </w:pPr>
-      <w:r>
+        <w:rPr>
+          <w:lang w:val="fr-FR"/>
+        </w:rPr>
+      </w:pPr>
+      <w:r>
+        <w:rPr>
+          <w:lang w:val="fr-FR"/>
+        </w:rPr>
         <w:t>14.2. Niveau 2 — Préparation du terrain d’adaptation : réduire la mobilisation devenue inutile</w:t>
       </w:r>
     </w:p>
     <w:p>
       <w:pPr>
         <w:pStyle w:val="BodyText"/>
-      </w:pPr>
-      <w:r>
+        <w:rPr>
+          <w:lang w:val="fr-FR"/>
+        </w:rPr>
+      </w:pPr>
+      <w:r>
+        <w:rPr>
+          <w:lang w:val="fr-FR"/>
+        </w:rPr>
         <w:t>Le deuxième niveau concerne les voies neuro-végétatives et les structures systémiques qui participent à la mobilisation et à la récupération. Le praticien peut reconnaître une mobilisation devenue inutile à travers un tonus musculaire défensif, une respiration haute ou peu adaptable, une vigilance excessive ou le maintien d’une tension corporelle globale.</w:t>
       </w:r>
     </w:p>
     <w:p>
       <w:pPr>
         <w:pStyle w:val="BodyText"/>
-      </w:pPr>
-      <w:r>
+        <w:rPr>
+          <w:lang w:val="fr-FR"/>
+        </w:rPr>
+      </w:pPr>
+      <w:r>
+        <w:rPr>
+          <w:lang w:val="fr-FR"/>
+        </w:rPr>
         <w:t>L’objectif n’est pas d’inhiber le sympathique ni de rechercher une domination parasympathique. Le sympathique est indispensable à l’action et le parasympathique à la restauration ; la cible clinique reste la flexibilité entre ces deux dynamiques.</w:t>
       </w:r>
     </w:p>
     <w:p>
       <w:pPr>
         <w:pStyle w:val="ListBullet"/>
+        <w:rPr>
+          <w:lang w:val="fr-FR"/>
+        </w:rPr>
       </w:pPr>
       <w:r>
         <w:rPr>
           <w:b/>
+          <w:lang w:val="fr-FR"/>
         </w:rPr>
         <w:t>Régulation neuro-végétative — Repères ROP possibles :</w:t>
       </w:r>
       <w:r>
+        <w:rPr>
+          <w:lang w:val="fr-FR"/>
+        </w:rPr>
         <w:t xml:space="preserve"> chaîne sympathique cervicale et cervico-thoracique ; ganglions cervicaux ; charnière C7–T1 ; première côte ; colonne thoracique et thoraco-lombaire ; voies sympathiques viscérales ; voies parasympathiques crâniennes et sacrées ; plexus autonomes ; zones surrénaliennes ; relations avec les axes SAM et HHS.</w:t>
       </w:r>
     </w:p>
@@ -3670,272 +3793,507 @@
       <w:r>
         <w:rPr>
           <w:b/>
+          <w:lang w:val="fr-FR"/>
         </w:rPr>
         <w:t>Soutien systémique selon les tests :</w:t>
       </w:r>
       <w:r>
-        <w:t xml:space="preserve"> glandes surrénales ; foie ; reins ; intestins ou autres structures métaboliques et homéostatiques pertinentes. Ces cibles ne constituent pas un passage obligatoire.</w:t>
+        <w:rPr>
+          <w:lang w:val="fr-FR"/>
+        </w:rPr>
+        <w:t xml:space="preserve"> glandes surrénales ; foie ; reins ; intestins ou autres structures métaboliques et homéostatiques pertinentes. </w:t>
+      </w:r>
+      <w:proofErr w:type="spellStart"/>
+      <w:r>
+        <w:t>Ces</w:t>
+      </w:r>
+      <w:proofErr w:type="spellEnd"/>
+      <w:r>
+        <w:t xml:space="preserve"> </w:t>
+      </w:r>
+      <w:proofErr w:type="spellStart"/>
+      <w:r>
+        <w:t>cibles</w:t>
+      </w:r>
+      <w:proofErr w:type="spellEnd"/>
+      <w:r>
+        <w:t xml:space="preserve"> ne constituent pas un passage obligatoire.</w:t>
       </w:r>
     </w:p>
     <w:p>
       <w:pPr>
         <w:pStyle w:val="ListBullet"/>
+        <w:rPr>
+          <w:lang w:val="fr-FR"/>
+        </w:rPr>
       </w:pPr>
       <w:r>
         <w:rPr>
           <w:b/>
+          <w:lang w:val="fr-FR"/>
         </w:rPr>
         <w:t>Objectif clinique :</w:t>
       </w:r>
       <w:r>
+        <w:rPr>
+          <w:lang w:val="fr-FR"/>
+        </w:rPr>
         <w:t xml:space="preserve"> accompagner le retrait d’un tonus de défense devenu inutile et favoriser le retour vers une ligne de base autonome plus souple.</w:t>
       </w:r>
     </w:p>
     <w:p>
       <w:pPr>
         <w:pStyle w:val="ListBullet"/>
+        <w:rPr>
+          <w:lang w:val="fr-FR"/>
+        </w:rPr>
       </w:pPr>
       <w:r>
         <w:rPr>
           <w:b/>
+          <w:lang w:val="fr-FR"/>
         </w:rPr>
         <w:t>Lecture anatomique :</w:t>
       </w:r>
       <w:r>
-        <w:t xml:space="preserve"> ce niveau correspond principalement au système nerveux autonome, complété si nécessaire par des soutiens neuro-endocriniens ou métaboliques.</w:t>
+        <w:rPr>
+          <w:lang w:val="fr-FR"/>
+        </w:rPr>
+        <w:t xml:space="preserve"> ce niveau correspond principalement au système nerveux autonome, complété si nécessaire par des soutiens </w:t>
+      </w:r>
+      <w:proofErr w:type="spellStart"/>
+      <w:r>
+        <w:rPr>
+          <w:lang w:val="fr-FR"/>
+        </w:rPr>
+        <w:t>neuro-endocriniens</w:t>
+      </w:r>
+      <w:proofErr w:type="spellEnd"/>
+      <w:r>
+        <w:rPr>
+          <w:lang w:val="fr-FR"/>
+        </w:rPr>
+        <w:t xml:space="preserve"> ou métaboliques.</w:t>
       </w:r>
     </w:p>
     <w:p>
       <w:pPr>
         <w:pStyle w:val="ListBullet"/>
+        <w:rPr>
+          <w:lang w:val="fr-FR"/>
+        </w:rPr>
       </w:pPr>
       <w:r>
         <w:rPr>
           <w:b/>
+          <w:lang w:val="fr-FR"/>
         </w:rPr>
         <w:t>Limite :</w:t>
       </w:r>
       <w:r>
+        <w:rPr>
+          <w:lang w:val="fr-FR"/>
+        </w:rPr>
         <w:t xml:space="preserve"> une séance ne permet pas de conclure à une normalisation du cortisol, de l’axe HHS, des catécholamines ou d’une fonction métabolique sans mesures spécifiques.</w:t>
       </w:r>
     </w:p>
     <w:p>
       <w:pPr>
         <w:pStyle w:val="Heading2"/>
-      </w:pPr>
-      <w:r>
+        <w:rPr>
+          <w:lang w:val="fr-FR"/>
+        </w:rPr>
+      </w:pPr>
+      <w:r>
+        <w:rPr>
+          <w:lang w:val="fr-FR"/>
+        </w:rPr>
         <w:t>14.3. Niveau 3 — Interfaces loco-régionales : libérer les contraintes qui entretiennent le signal</w:t>
       </w:r>
     </w:p>
     <w:p>
       <w:pPr>
         <w:pStyle w:val="BodyText"/>
-      </w:pPr>
-      <w:r>
-        <w:t>Le troisième niveau concerne les structures régionales susceptibles de continuer à transmettre au système nerveux des informations de tension, de restriction ou d’inconfort. Ces interfaces peuvent être mécaniques, fasciales, ligamentaires, musculaires, séreuses, neurovasculaires, viscéro-pariétales ou respiratoires. Elles peuvent se situer dans les régions crânio-cervicale, thoracique, diaphragmatique, abdominale, pelvienne ou périnéale.</w:t>
+        <w:rPr>
+          <w:lang w:val="fr-FR"/>
+        </w:rPr>
+      </w:pPr>
+      <w:r>
+        <w:rPr>
+          <w:lang w:val="fr-FR"/>
+        </w:rPr>
+        <w:t xml:space="preserve">Le troisième niveau concerne les structures régionales susceptibles de continuer à transmettre au système nerveux des informations de tension, de restriction ou d’inconfort. Ces interfaces peuvent être mécaniques, fasciales, ligamentaires, musculaires, séreuses, neurovasculaires, </w:t>
+      </w:r>
+      <w:proofErr w:type="spellStart"/>
+      <w:r>
+        <w:rPr>
+          <w:lang w:val="fr-FR"/>
+        </w:rPr>
+        <w:t>viscéro</w:t>
+      </w:r>
+      <w:proofErr w:type="spellEnd"/>
+      <w:r>
+        <w:rPr>
+          <w:lang w:val="fr-FR"/>
+        </w:rPr>
+        <w:t>-pariétales ou respiratoires. Elles peuvent se situer dans les régions crânio-cervicale, thoracique, diaphragmatique, abdominale, pelvienne ou périnéale.</w:t>
       </w:r>
     </w:p>
     <w:p>
       <w:pPr>
         <w:pStyle w:val="BodyText"/>
-      </w:pPr>
-      <w:r>
+        <w:rPr>
+          <w:lang w:val="fr-FR"/>
+        </w:rPr>
+      </w:pPr>
+      <w:r>
+        <w:rPr>
+          <w:lang w:val="fr-FR"/>
+        </w:rPr>
         <w:t>Le niveau 3 est donc plus large que la seule respiration. La disponibilité respiratoire en constitue néanmoins un exemple clinique majeur dans le chapitre sur le stress.</w:t>
       </w:r>
     </w:p>
     <w:p>
       <w:pPr>
         <w:pStyle w:val="BodyText"/>
-      </w:pPr>
-      <w:r>
+        <w:rPr>
+          <w:lang w:val="fr-FR"/>
+        </w:rPr>
+      </w:pPr>
+      <w:r>
+        <w:rPr>
+          <w:lang w:val="fr-FR"/>
+        </w:rPr>
+        <w:lastRenderedPageBreak/>
         <w:t>Sous stress, la respiration peut devenir haute, rapide, irrégulière ou momentanément bloquée. Les tensions du diaphragme, des muscles inspirateurs accessoires et du hiatus œsophagien peuvent entretenir les sensations d’oppression et renvoyer au système nerveux un nouveau message d’alarme.</w:t>
       </w:r>
     </w:p>
     <w:p>
       <w:pPr>
         <w:pStyle w:val="ListBullet"/>
+        <w:rPr>
+          <w:lang w:val="fr-FR"/>
+        </w:rPr>
       </w:pPr>
       <w:r>
         <w:rPr>
           <w:b/>
+          <w:lang w:val="fr-FR"/>
         </w:rPr>
         <w:t>Repères ROP respiratoires possibles :</w:t>
       </w:r>
       <w:r>
-        <w:t xml:space="preserve"> nerf phrénique C3–C5 ; triangle de Sédillot ; diaphragme ; coupoles et piliers ; hiatus œsophagien ; plexus cardio-pulmonaires ; trajet thoracique du nerf vague.</w:t>
+        <w:rPr>
+          <w:lang w:val="fr-FR"/>
+        </w:rPr>
+        <w:t xml:space="preserve"> nerf phrénique C3–C5 ; triangle de </w:t>
+      </w:r>
+      <w:proofErr w:type="spellStart"/>
+      <w:r>
+        <w:rPr>
+          <w:lang w:val="fr-FR"/>
+        </w:rPr>
+        <w:t>Sédillot</w:t>
+      </w:r>
+      <w:proofErr w:type="spellEnd"/>
+      <w:r>
+        <w:rPr>
+          <w:lang w:val="fr-FR"/>
+        </w:rPr>
+        <w:t xml:space="preserve"> ; diaphragme ; coupoles et piliers ; hiatus œsophagien ; plexus cardio-pulmonaires ; trajet thoracique du nerf vague.</w:t>
       </w:r>
     </w:p>
     <w:p>
       <w:pPr>
         <w:pStyle w:val="ListBullet"/>
+        <w:rPr>
+          <w:lang w:val="fr-FR"/>
+        </w:rPr>
       </w:pPr>
       <w:r>
         <w:rPr>
           <w:b/>
+          <w:lang w:val="fr-FR"/>
         </w:rPr>
         <w:t>Autres interfaces possibles selon la région :</w:t>
       </w:r>
       <w:r>
-        <w:t xml:space="preserve"> péritoine ; mésos et ligaments viscéraux ; fascias ; muscles et chaînes myofasciales ; articulations costovertébrales ; foramens et hiatus ; plexus abdominaux ; plexus hypogastriques ; cavité pelvienne ; périnée ; passages neurovasculaires régionaux.</w:t>
+        <w:rPr>
+          <w:lang w:val="fr-FR"/>
+        </w:rPr>
+        <w:t xml:space="preserve"> péritoine ; mésos et ligaments viscéraux ; fascias ; muscles et chaînes </w:t>
+      </w:r>
+      <w:proofErr w:type="spellStart"/>
+      <w:r>
+        <w:rPr>
+          <w:lang w:val="fr-FR"/>
+        </w:rPr>
+        <w:t>myofasciales</w:t>
+      </w:r>
+      <w:proofErr w:type="spellEnd"/>
+      <w:r>
+        <w:rPr>
+          <w:lang w:val="fr-FR"/>
+        </w:rPr>
+        <w:t xml:space="preserve"> ; articulations </w:t>
+      </w:r>
+      <w:proofErr w:type="spellStart"/>
+      <w:r>
+        <w:rPr>
+          <w:lang w:val="fr-FR"/>
+        </w:rPr>
+        <w:t>costovertébrales</w:t>
+      </w:r>
+      <w:proofErr w:type="spellEnd"/>
+      <w:r>
+        <w:rPr>
+          <w:lang w:val="fr-FR"/>
+        </w:rPr>
+        <w:t xml:space="preserve"> ; foramens et hiatus ; plexus abdominaux ; plexus hypogastriques ; cavité pelvienne ; périnée ; passages neurovasculaires régionaux.</w:t>
       </w:r>
     </w:p>
     <w:p>
       <w:pPr>
         <w:pStyle w:val="ListBullet"/>
+        <w:rPr>
+          <w:lang w:val="fr-FR"/>
+        </w:rPr>
       </w:pPr>
       <w:r>
         <w:rPr>
           <w:b/>
+          <w:lang w:val="fr-FR"/>
         </w:rPr>
         <w:t>Objectif clinique :</w:t>
       </w:r>
       <w:r>
+        <w:rPr>
+          <w:lang w:val="fr-FR"/>
+        </w:rPr>
         <w:t xml:space="preserve"> diminuer les contraintes régionales susceptibles d’entretenir le tonus défensif et restaurer une meilleure disponibilité mécanique, respiratoire et viscérale.</w:t>
       </w:r>
     </w:p>
     <w:p>
       <w:pPr>
         <w:pStyle w:val="ListBullet"/>
+        <w:rPr>
+          <w:lang w:val="fr-FR"/>
+        </w:rPr>
       </w:pPr>
       <w:r>
         <w:rPr>
           <w:b/>
+          <w:lang w:val="fr-FR"/>
         </w:rPr>
         <w:t>Application respiratoire :</w:t>
       </w:r>
       <w:r>
+        <w:rPr>
+          <w:lang w:val="fr-FR"/>
+        </w:rPr>
         <w:t xml:space="preserve"> rendre la respiration moins coûteuse et plus adaptable, sans imposer une amplitude excessive.</w:t>
       </w:r>
     </w:p>
     <w:p>
       <w:pPr>
         <w:pStyle w:val="ListBullet"/>
+        <w:rPr>
+          <w:lang w:val="fr-FR"/>
+        </w:rPr>
       </w:pPr>
       <w:r>
         <w:rPr>
           <w:b/>
+          <w:lang w:val="fr-FR"/>
         </w:rPr>
         <w:t>Lecture anatomique :</w:t>
       </w:r>
       <w:r>
+        <w:rPr>
+          <w:lang w:val="fr-FR"/>
+        </w:rPr>
         <w:t xml:space="preserve"> ce niveau correspond aux interfaces loco-régionales développées dans les chapitres sur les cavités, le diaphragme, le péritoine et les régions pelviennes.</w:t>
       </w:r>
     </w:p>
     <w:p>
       <w:pPr>
         <w:pStyle w:val="ListBullet"/>
+        <w:rPr>
+          <w:lang w:val="fr-FR"/>
+        </w:rPr>
       </w:pPr>
       <w:r>
         <w:rPr>
           <w:b/>
+          <w:lang w:val="fr-FR"/>
         </w:rPr>
         <w:t>Appui scientifique indirect :</w:t>
       </w:r>
       <w:r>
+        <w:rPr>
+          <w:lang w:val="fr-FR"/>
+        </w:rPr>
         <w:t xml:space="preserve"> les interventions respiratoires diaphragmatiques peuvent réduire certains marqueurs physiologiques et subjectifs du stress, avec une qualité de preuve encore variable [8].</w:t>
       </w:r>
     </w:p>
     <w:p>
       <w:pPr>
         <w:pStyle w:val="ListBullet"/>
+        <w:rPr>
+          <w:lang w:val="fr-FR"/>
+        </w:rPr>
       </w:pPr>
       <w:r>
         <w:rPr>
           <w:b/>
+          <w:lang w:val="fr-FR"/>
         </w:rPr>
         <w:t>Limite :</w:t>
       </w:r>
       <w:r>
+        <w:rPr>
+          <w:lang w:val="fr-FR"/>
+        </w:rPr>
         <w:t xml:space="preserve"> une amélioration de la respiration, de la mobilité ou du confort ne démontre pas qu’une structure nerveuse, fasciale ou viscérale précise a été directement « libérée » ou normalisée.</w:t>
       </w:r>
     </w:p>
     <w:p>
       <w:pPr>
         <w:pStyle w:val="Heading2"/>
-      </w:pPr>
-      <w:r>
+        <w:rPr>
+          <w:lang w:val="fr-FR"/>
+        </w:rPr>
+      </w:pPr>
+      <w:r>
+        <w:rPr>
+          <w:lang w:val="fr-FR"/>
+        </w:rPr>
         <w:t>14.4. Niveau 4 — Cible viscérale ou fonctionnelle spécifique : permettre le retour de la fonction concernée</w:t>
       </w:r>
     </w:p>
     <w:p>
       <w:pPr>
         <w:pStyle w:val="BodyText"/>
-      </w:pPr>
-      <w:r>
+        <w:rPr>
+          <w:lang w:val="fr-FR"/>
+        </w:rPr>
+      </w:pPr>
+      <w:r>
+        <w:rPr>
+          <w:lang w:val="fr-FR"/>
+        </w:rPr>
         <w:t>Le quatrième niveau correspond à l’expression spécifique du trouble chez le patient. Lorsque la mobilisation défensive diminue et que les interfaces régionales retrouvent davantage de disponibilité, l’organisme peut de nouveau investir certaines fonctions temporairement mises au second plan : digestion, assimilation, élimination, miction, sommeil, récupération, sexualité, respiration, mobilité fonctionnelle ou confort viscéral.</w:t>
       </w:r>
     </w:p>
     <w:p>
       <w:pPr>
         <w:pStyle w:val="BodyText"/>
-      </w:pPr>
-      <w:r>
+        <w:rPr>
+          <w:lang w:val="fr-FR"/>
+        </w:rPr>
+      </w:pPr>
+      <w:r>
+        <w:rPr>
+          <w:lang w:val="fr-FR"/>
+        </w:rPr>
         <w:t>Dans le chapitre sur le stress, la cible n’est donc pas nécessairement un organe unique. Elle peut être une fonction ou un symptôme clairement identifié avant la séance.</w:t>
       </w:r>
     </w:p>
     <w:p>
       <w:pPr>
         <w:pStyle w:val="ListBullet"/>
+        <w:rPr>
+          <w:lang w:val="fr-FR"/>
+        </w:rPr>
       </w:pPr>
       <w:r>
         <w:rPr>
           <w:b/>
+          <w:lang w:val="fr-FR"/>
         </w:rPr>
         <w:t>Repères ROP possibles, variables selon la cible :</w:t>
       </w:r>
       <w:r>
+        <w:rPr>
+          <w:lang w:val="fr-FR"/>
+        </w:rPr>
         <w:t xml:space="preserve"> voies vagales ou sympathiques du territoire concerné ; plexus cœliaque ; chaîne prévertébrale ; nerfs splanchniques ; système nerveux entérique ; plexus hypogastriques ; parasympathique pelvien S2–S4 ; zones réflexes propres à l’organe ou à la fonction ciblée.</w:t>
       </w:r>
     </w:p>
     <w:p>
       <w:pPr>
         <w:pStyle w:val="ListBullet"/>
+        <w:rPr>
+          <w:lang w:val="fr-FR"/>
+        </w:rPr>
       </w:pPr>
       <w:r>
         <w:rPr>
           <w:b/>
+          <w:lang w:val="fr-FR"/>
         </w:rPr>
         <w:t>Objectif clinique :</w:t>
       </w:r>
       <w:r>
+        <w:rPr>
+          <w:lang w:val="fr-FR"/>
+        </w:rPr>
         <w:t xml:space="preserve"> créer un contexte autonome et régional plus favorable au retour de la fonction concernée.</w:t>
       </w:r>
     </w:p>
     <w:p>
       <w:pPr>
         <w:pStyle w:val="ListBullet"/>
+        <w:rPr>
+          <w:lang w:val="fr-FR"/>
+        </w:rPr>
       </w:pPr>
       <w:r>
         <w:rPr>
           <w:b/>
+          <w:lang w:val="fr-FR"/>
         </w:rPr>
         <w:t>Lecture anatomique :</w:t>
       </w:r>
       <w:r>
+        <w:rPr>
+          <w:lang w:val="fr-FR"/>
+        </w:rPr>
         <w:t xml:space="preserve"> ce niveau correspond aux chapitres d’organes et à la cible viscérale ou fonctionnelle individualisée.</w:t>
       </w:r>
     </w:p>
     <w:p>
       <w:pPr>
         <w:pStyle w:val="ListBullet"/>
+        <w:rPr>
+          <w:lang w:val="fr-FR"/>
+        </w:rPr>
       </w:pPr>
       <w:r>
         <w:rPr>
           <w:b/>
+          <w:lang w:val="fr-FR"/>
         </w:rPr>
         <w:t>Limite :</w:t>
       </w:r>
       <w:r>
+        <w:rPr>
+          <w:lang w:val="fr-FR"/>
+        </w:rPr>
         <w:t xml:space="preserve"> les symptômes persistants, inhabituels ou associés à des signes d’alerte nécessitent une évaluation médicale.</w:t>
       </w:r>
     </w:p>
     <w:p>
       <w:pPr>
         <w:pStyle w:val="BodyText"/>
+        <w:rPr>
+          <w:lang w:val="fr-FR"/>
+        </w:rPr>
       </w:pPr>
       <w:r>
         <w:rPr>
           <w:b/>
+          <w:lang w:val="fr-FR"/>
         </w:rPr>
         <w:t>SÉQUENCE SYNTHÉTIQUE</w:t>
       </w:r>
@@ -3943,8 +4301,14 @@
     <w:p>
       <w:pPr>
         <w:pStyle w:val="BodyText"/>
-      </w:pPr>
-      <w:r>
+        <w:rPr>
+          <w:lang w:val="fr-FR"/>
+        </w:rPr>
+      </w:pPr>
+      <w:r>
+        <w:rPr>
+          <w:lang w:val="fr-FR"/>
+        </w:rPr>
         <w:t>1. Régulation centrale : diminuer la persistance du signal d’alarme → 2. Préparation du terrain d’adaptation : réduire la mobilisation devenue inutile → 3. Interfaces loco-régionales : libérer les contraintes qui entretiennent le signal → 4. Cible viscérale ou fonctionnelle spécifique : permettre le retour de la fonction concernée.</w:t>
       </w:r>
     </w:p>
@@ -4058,6 +4422,7 @@
                 <w:sz w:val="20"/>
                 <w:lang w:val="fr-FR"/>
               </w:rPr>
+              <w:lastRenderedPageBreak/>
               <w:t>Une réaction après séance n’est jamais, à elle seule, une preuve de guérison. Nous l’évaluons selon son intensité, sa durée, son retentissement et le contexte médical du patient.</w:t>
             </w:r>
           </w:p>
@@ -4757,6 +5122,7 @@
         <w:rPr>
           <w:rFonts w:ascii="Liberation Sans" w:eastAsia="Liberation Sans" w:hAnsi="Liberation Sans"/>
         </w:rPr>
+        <w:lastRenderedPageBreak/>
         <w:t>18.2. Dessin d’étude proposé</w:t>
       </w:r>
     </w:p>
@@ -4789,7 +5155,6 @@
           <w:color w:val="2F3437"/>
           <w:lang w:val="fr-FR"/>
         </w:rPr>
-        <w:lastRenderedPageBreak/>
         <w:t>Groupe contrôle tactile : toucher occipital et podal de même durée, sans cartographie ni ordre ROP.</w:t>
       </w:r>
     </w:p>
@@ -5194,6 +5559,7 @@
         <w:pStyle w:val="ListBullet"/>
         <w:spacing w:after="40"/>
         <w:rPr>
+          <w:color w:val="2F3437"/>
           <w:lang w:val="fr-FR"/>
         </w:rPr>
       </w:pPr>
@@ -5203,6 +5569,22 @@
           <w:lang w:val="fr-FR"/>
         </w:rPr>
         <w:t>La ROP est surtout pertinente comme approche fonctionnelle et intégrative, dont les effets spécifiques restent à tester par des protocoles comparatifs.</w:t>
+      </w:r>
+    </w:p>
+    <w:p>
+      <w:pPr>
+        <w:spacing w:after="200" w:line="276" w:lineRule="auto"/>
+        <w:rPr>
+          <w:color w:val="2F3437"/>
+          <w:lang w:val="fr-FR"/>
+        </w:rPr>
+      </w:pPr>
+      <w:r>
+        <w:rPr>
+          <w:color w:val="2F3437"/>
+          <w:lang w:val="fr-FR"/>
+        </w:rPr>
+        <w:br w:type="page"/>
       </w:r>
     </w:p>
     <w:p>
@@ -5214,27 +5596,63 @@
         </w:numPr>
         <w:spacing w:after="40"/>
         <w:ind w:left="360" w:hanging="360"/>
-        <w:rPr>
-          <w:color w:val="2F3437"/>
-          <w:lang w:val="fr-FR"/>
-        </w:rPr>
-      </w:pPr>
-    </w:p>
-    <w:p>
-      <w:pPr>
-        <w:spacing w:after="200" w:line="276" w:lineRule="auto"/>
-        <w:rPr>
-          <w:color w:val="2F3437"/>
-          <w:lang w:val="fr-FR"/>
-        </w:rPr>
-      </w:pPr>
-      <w:r>
-        <w:rPr>
-          <w:color w:val="2F3437"/>
-          <w:lang w:val="fr-FR"/>
-        </w:rPr>
-        <w:br w:type="page"/>
-      </w:r>
+      </w:pPr>
+    </w:p>
+    <w:p>
+      <w:pPr>
+        <w:pStyle w:val="Heading1"/>
+        <w:rPr>
+          <w:rFonts w:ascii="Liberation Sans" w:eastAsia="Liberation Sans" w:hAnsi="Liberation Sans"/>
+          <w:lang w:val="fr-FR"/>
+        </w:rPr>
+      </w:pPr>
+      <w:r>
+        <w:rPr>
+          <w:rFonts w:ascii="Liberation Sans" w:eastAsia="Liberation Sans" w:hAnsi="Liberation Sans"/>
+          <w:lang w:val="fr-FR"/>
+        </w:rPr>
+        <w:t xml:space="preserve">Zones </w:t>
+      </w:r>
+      <w:proofErr w:type="spellStart"/>
+      <w:r>
+        <w:rPr>
+          <w:rFonts w:ascii="Liberation Sans" w:eastAsia="Liberation Sans" w:hAnsi="Liberation Sans"/>
+          <w:lang w:val="fr-FR"/>
+        </w:rPr>
+        <w:t>réflexes</w:t>
+      </w:r>
+      <w:proofErr w:type="spellEnd"/>
+      <w:r>
+        <w:rPr>
+          <w:rFonts w:ascii="Liberation Sans" w:eastAsia="Liberation Sans" w:hAnsi="Liberation Sans"/>
+          <w:lang w:val="fr-FR"/>
+        </w:rPr>
+        <w:t xml:space="preserve"> </w:t>
+      </w:r>
+      <w:proofErr w:type="spellStart"/>
+      <w:r>
+        <w:rPr>
+          <w:rFonts w:ascii="Liberation Sans" w:eastAsia="Liberation Sans" w:hAnsi="Liberation Sans"/>
+          <w:lang w:val="fr-FR"/>
+        </w:rPr>
+        <w:t>podales</w:t>
+      </w:r>
+      <w:proofErr w:type="spellEnd"/>
+    </w:p>
+    <w:p>
+      <w:pPr>
+        <w:pStyle w:val="ListBullet"/>
+        <w:numPr>
+          <w:ilvl w:val="0"/>
+          <w:numId w:val="0"/>
+        </w:numPr>
+        <w:spacing w:after="40"/>
+        <w:ind w:left="360"/>
+        <w:rPr>
+          <w:i/>
+          <w:iCs/>
+        </w:rPr>
+      </w:pPr>
     </w:p>
     <w:p>
       <w:pPr>
@@ -5246,75 +5664,23 @@
         <w:spacing w:after="40"/>
         <w:ind w:left="360" w:hanging="360"/>
         <w:rPr>
-          <w:lang w:val="fr-FR"/>
-        </w:rPr>
-      </w:pPr>
-    </w:p>
-    <w:p>
-      <w:pPr>
-        <w:pStyle w:val="Heading1"/>
-        <w:rPr>
-          <w:rFonts w:ascii="Liberation Sans" w:eastAsia="Liberation Sans" w:hAnsi="Liberation Sans"/>
-          <w:lang w:val="fr-FR"/>
-        </w:rPr>
-      </w:pPr>
-      <w:r>
-        <w:rPr>
-          <w:rFonts w:ascii="Liberation Sans" w:eastAsia="Liberation Sans" w:hAnsi="Liberation Sans"/>
-          <w:lang w:val="fr-FR"/>
-        </w:rPr>
-        <w:t xml:space="preserve">Zones reflexes </w:t>
+          <w:i/>
+          <w:iCs/>
+        </w:rPr>
+      </w:pPr>
+      <w:proofErr w:type="gramStart"/>
+      <w:r>
+        <w:rPr>
+          <w:i/>
+          <w:iCs/>
+        </w:rPr>
+        <w:t xml:space="preserve">Zones </w:t>
       </w:r>
       <w:proofErr w:type="spellStart"/>
       <w:r>
         <w:rPr>
-          <w:rFonts w:ascii="Liberation Sans" w:eastAsia="Liberation Sans" w:hAnsi="Liberation Sans"/>
-          <w:lang w:val="fr-FR"/>
-        </w:rPr>
-        <w:t>podales</w:t>
-      </w:r>
-      <w:proofErr w:type="spellEnd"/>
-      <w:r>
-        <w:rPr>
-          <w:rFonts w:ascii="Liberation Sans" w:eastAsia="Liberation Sans" w:hAnsi="Liberation Sans"/>
-          <w:lang w:val="fr-FR"/>
-        </w:rPr>
-        <w:t xml:space="preserve">  </w:t>
-      </w:r>
-    </w:p>
-    <w:p>
-      <w:pPr>
-        <w:pStyle w:val="ListParagraph"/>
-        <w:numPr>
-          <w:ilvl w:val="1"/>
-          <w:numId w:val="18"/>
-        </w:numPr>
-        <w:spacing w:after="200" w:line="276" w:lineRule="auto"/>
-        <w:jc w:val="both"/>
-        <w:rPr>
-          <w:rFonts w:ascii="Times New Roman" w:hAnsi="Times New Roman" w:cs="Times New Roman"/>
-          <w:b/>
-          <w:sz w:val="24"/>
-          <w:szCs w:val="24"/>
-        </w:rPr>
-      </w:pPr>
-      <w:proofErr w:type="gramStart"/>
-      <w:r>
-        <w:rPr>
-          <w:rFonts w:ascii="Times New Roman" w:hAnsi="Times New Roman" w:cs="Times New Roman"/>
-          <w:b/>
-          <w:sz w:val="24"/>
-          <w:szCs w:val="24"/>
-        </w:rPr>
-        <w:t xml:space="preserve">Zones </w:t>
-      </w:r>
-      <w:proofErr w:type="spellStart"/>
-      <w:r>
-        <w:rPr>
-          <w:rFonts w:ascii="Times New Roman" w:hAnsi="Times New Roman" w:cs="Times New Roman"/>
-          <w:b/>
-          <w:sz w:val="24"/>
-          <w:szCs w:val="24"/>
+          <w:i/>
+          <w:iCs/>
         </w:rPr>
         <w:t>occipitales</w:t>
       </w:r>
@@ -5323,476 +5689,175 @@
     </w:p>
     <w:p>
       <w:pPr>
-        <w:pStyle w:val="ListParagraph"/>
-        <w:numPr>
-          <w:ilvl w:val="1"/>
-          <w:numId w:val="18"/>
-        </w:numPr>
-        <w:spacing w:after="200" w:line="276" w:lineRule="auto"/>
-        <w:jc w:val="both"/>
-        <w:rPr>
-          <w:rFonts w:ascii="Times New Roman" w:hAnsi="Times New Roman" w:cs="Times New Roman"/>
-          <w:b/>
-          <w:sz w:val="24"/>
-          <w:szCs w:val="24"/>
-        </w:rPr>
-      </w:pPr>
-      <w:r>
-        <w:rPr>
-          <w:rFonts w:ascii="Times New Roman" w:hAnsi="Times New Roman" w:cs="Times New Roman"/>
-          <w:b/>
-          <w:sz w:val="24"/>
-          <w:szCs w:val="24"/>
-        </w:rPr>
-        <w:t xml:space="preserve">Syndrome </w:t>
-      </w:r>
-      <w:proofErr w:type="spellStart"/>
-      <w:r>
-        <w:rPr>
-          <w:rFonts w:ascii="Times New Roman" w:hAnsi="Times New Roman" w:cs="Times New Roman"/>
-          <w:b/>
-          <w:sz w:val="24"/>
-          <w:szCs w:val="24"/>
-        </w:rPr>
-        <w:t>général</w:t>
-      </w:r>
-      <w:proofErr w:type="spellEnd"/>
-      <w:r>
-        <w:rPr>
-          <w:rFonts w:ascii="Times New Roman" w:hAnsi="Times New Roman" w:cs="Times New Roman"/>
-          <w:b/>
-          <w:sz w:val="24"/>
-          <w:szCs w:val="24"/>
-        </w:rPr>
-        <w:t xml:space="preserve"> </w:t>
-      </w:r>
-      <w:proofErr w:type="spellStart"/>
-      <w:r>
-        <w:rPr>
-          <w:rFonts w:ascii="Times New Roman" w:hAnsi="Times New Roman" w:cs="Times New Roman"/>
-          <w:b/>
-          <w:sz w:val="24"/>
-          <w:szCs w:val="24"/>
-        </w:rPr>
-        <w:t>d’adaptation</w:t>
-      </w:r>
-      <w:proofErr w:type="spellEnd"/>
-      <w:r>
-        <w:rPr>
-          <w:rFonts w:ascii="Times New Roman" w:hAnsi="Times New Roman" w:cs="Times New Roman"/>
-          <w:b/>
-          <w:sz w:val="24"/>
-          <w:szCs w:val="24"/>
-        </w:rPr>
-        <w:t xml:space="preserve"> SGA</w:t>
-      </w:r>
-      <w:r>
-        <w:rPr>
-          <w:rFonts w:ascii="Times New Roman" w:hAnsi="Times New Roman" w:cs="Times New Roman"/>
-          <w:b/>
-          <w:sz w:val="24"/>
-          <w:szCs w:val="24"/>
-        </w:rPr>
-        <w:t xml:space="preserve"> </w:t>
-      </w:r>
-    </w:p>
-    <w:p>
-      <w:pPr>
-        <w:pStyle w:val="ListParagraph"/>
+        <w:pStyle w:val="ListBullet"/>
         <w:numPr>
           <w:ilvl w:val="0"/>
-          <w:numId w:val="19"/>
+          <w:numId w:val="0"/>
         </w:numPr>
-        <w:spacing w:after="200" w:line="276" w:lineRule="auto"/>
-        <w:jc w:val="both"/>
-        <w:rPr>
-          <w:rFonts w:ascii="Times New Roman" w:hAnsi="Times New Roman" w:cs="Times New Roman"/>
-          <w:b/>
-          <w:sz w:val="24"/>
-          <w:szCs w:val="24"/>
-          <w:lang w:val="fr-FR"/>
-        </w:rPr>
-      </w:pPr>
-      <w:r>
-        <w:rPr>
-          <w:rFonts w:ascii="Times New Roman" w:hAnsi="Times New Roman" w:cs="Times New Roman"/>
-          <w:b/>
-          <w:sz w:val="24"/>
-          <w:szCs w:val="24"/>
-          <w:lang w:val="fr-FR"/>
-        </w:rPr>
-        <w:t>Système limbique, diencéphale, tronc cérébral hypophyse, surrénales (axe HHS) ;</w:t>
-      </w:r>
-    </w:p>
-    <w:p>
-      <w:pPr>
-        <w:pStyle w:val="ListParagraph"/>
+        <w:spacing w:after="40"/>
+        <w:ind w:left="360"/>
+        <w:rPr>
+          <w:lang w:val="fr-FR"/>
+        </w:rPr>
+      </w:pPr>
+    </w:p>
+    <w:p>
+      <w:pPr>
+        <w:pStyle w:val="ListBullet"/>
         <w:numPr>
           <w:ilvl w:val="0"/>
-          <w:numId w:val="19"/>
+          <w:numId w:val="0"/>
         </w:numPr>
-        <w:spacing w:after="200" w:line="276" w:lineRule="auto"/>
-        <w:jc w:val="both"/>
-        <w:rPr>
-          <w:rFonts w:ascii="Times New Roman" w:hAnsi="Times New Roman" w:cs="Times New Roman"/>
-          <w:b/>
-          <w:sz w:val="24"/>
-          <w:szCs w:val="24"/>
-          <w:lang w:val="fr-FR"/>
-        </w:rPr>
-      </w:pPr>
-      <w:r>
-        <w:rPr>
-          <w:rFonts w:ascii="Times New Roman" w:hAnsi="Times New Roman" w:cs="Times New Roman"/>
-          <w:b/>
-          <w:sz w:val="24"/>
-          <w:szCs w:val="24"/>
-          <w:lang w:val="fr-FR"/>
-        </w:rPr>
-        <w:t>Nerfs crâniens </w:t>
-      </w:r>
-      <w:r>
-        <w:rPr>
-          <w:rFonts w:ascii="Times New Roman" w:hAnsi="Times New Roman" w:cs="Times New Roman"/>
-          <w:sz w:val="24"/>
-          <w:szCs w:val="24"/>
-          <w:lang w:val="fr-FR"/>
-        </w:rPr>
-        <w:t>: Jumeau V, Vague X, Hypoglosse XI, C2 et C3 ;</w:t>
-      </w:r>
-    </w:p>
-    <w:p>
-      <w:pPr>
-        <w:pStyle w:val="ListParagraph"/>
+        <w:spacing w:after="40"/>
+        <w:ind w:left="360"/>
+        <w:rPr>
+          <w:lang w:val="fr-FR"/>
+        </w:rPr>
+      </w:pPr>
+      <w:r>
+        <w:rPr>
+          <w:lang w:val="fr-FR"/>
+        </w:rPr>
+        <w:t xml:space="preserve">Dans la pratique ROP, la sollicitation douce des zones occipitales vise d’abord à apaiser le système avant un travail plus ciblé. Par l’intermédiaire des afférences cutanées, </w:t>
+      </w:r>
+      <w:proofErr w:type="spellStart"/>
+      <w:r>
+        <w:rPr>
+          <w:lang w:val="fr-FR"/>
+        </w:rPr>
+        <w:t>myofasciales</w:t>
+      </w:r>
+      <w:proofErr w:type="spellEnd"/>
+      <w:r>
+        <w:rPr>
+          <w:lang w:val="fr-FR"/>
+        </w:rPr>
+        <w:t xml:space="preserve"> et proprioceptives de la région C2-C3, elle peut contribuer à réduire l’hypervigilance, les tensions de protection, la surcharge nociceptive et l’agitation respiratoire ou émotionnelle.</w:t>
+      </w:r>
+    </w:p>
+    <w:p>
+      <w:pPr>
+        <w:pStyle w:val="ListBullet"/>
         <w:numPr>
           <w:ilvl w:val="0"/>
-          <w:numId w:val="19"/>
+          <w:numId w:val="0"/>
         </w:numPr>
-        <w:spacing w:after="200" w:line="276" w:lineRule="auto"/>
-        <w:jc w:val="both"/>
-        <w:rPr>
-          <w:rFonts w:ascii="Times New Roman" w:hAnsi="Times New Roman" w:cs="Times New Roman"/>
-          <w:sz w:val="24"/>
-          <w:szCs w:val="24"/>
-          <w:lang w:val="fr-FR"/>
-        </w:rPr>
-      </w:pPr>
-      <w:r>
-        <w:rPr>
-          <w:rFonts w:ascii="Times New Roman" w:hAnsi="Times New Roman" w:cs="Times New Roman"/>
-          <w:b/>
-          <w:sz w:val="24"/>
-          <w:szCs w:val="24"/>
-          <w:lang w:val="fr-FR"/>
-        </w:rPr>
-        <w:t>Nerf vague X </w:t>
-      </w:r>
-      <w:r>
-        <w:rPr>
-          <w:rFonts w:ascii="Times New Roman" w:hAnsi="Times New Roman" w:cs="Times New Roman"/>
-          <w:sz w:val="24"/>
-          <w:szCs w:val="24"/>
-          <w:lang w:val="fr-FR"/>
-        </w:rPr>
-        <w:t>: foramen magnum, foramen jugulaire, loge viscérale du cou, plexus cardio-pulmonaire, hiatus œsophagien, plexus cœliaque ;</w:t>
-      </w:r>
-    </w:p>
-    <w:p>
-      <w:pPr>
-        <w:pStyle w:val="ListParagraph"/>
+        <w:spacing w:after="40"/>
+        <w:ind w:left="360"/>
+        <w:rPr>
+          <w:lang w:val="fr-FR"/>
+        </w:rPr>
+      </w:pPr>
+    </w:p>
+    <w:p>
+      <w:pPr>
+        <w:pStyle w:val="ListBullet"/>
         <w:numPr>
           <w:ilvl w:val="0"/>
-          <w:numId w:val="19"/>
+          <w:numId w:val="0"/>
         </w:numPr>
-        <w:spacing w:after="200" w:line="276" w:lineRule="auto"/>
-        <w:jc w:val="both"/>
-        <w:rPr>
-          <w:rFonts w:ascii="Times New Roman" w:hAnsi="Times New Roman" w:cs="Times New Roman"/>
-          <w:sz w:val="24"/>
-          <w:szCs w:val="24"/>
-          <w:lang w:val="fr-FR"/>
-        </w:rPr>
-      </w:pPr>
-      <w:r>
-        <w:rPr>
-          <w:rFonts w:ascii="Times New Roman" w:hAnsi="Times New Roman" w:cs="Times New Roman"/>
-          <w:b/>
-          <w:sz w:val="24"/>
-          <w:szCs w:val="24"/>
-          <w:lang w:val="fr-FR"/>
-        </w:rPr>
-        <w:t>Colonne vertébrale </w:t>
-      </w:r>
-      <w:r>
-        <w:rPr>
-          <w:rFonts w:ascii="Times New Roman" w:hAnsi="Times New Roman" w:cs="Times New Roman"/>
-          <w:sz w:val="24"/>
-          <w:szCs w:val="24"/>
-          <w:lang w:val="fr-FR"/>
-        </w:rPr>
-        <w:t>: systèmes sympathique C8 à L2 et parasympathique pelvien S2 à S4 ;</w:t>
-      </w:r>
-    </w:p>
-    <w:p>
-      <w:pPr>
-        <w:pStyle w:val="ListParagraph"/>
+        <w:spacing w:after="40"/>
+        <w:ind w:left="360"/>
+        <w:rPr>
+          <w:lang w:val="fr-FR"/>
+        </w:rPr>
+      </w:pPr>
+      <w:r>
+        <w:rPr>
+          <w:lang w:val="fr-FR"/>
+        </w:rPr>
+        <w:t xml:space="preserve">Les trois bandes — parasympathique, orthosympathique et structurelle — restent des repères cliniques dont </w:t>
+      </w:r>
+    </w:p>
+    <w:p>
+      <w:pPr>
+        <w:pStyle w:val="ListBullet"/>
         <w:numPr>
           <w:ilvl w:val="0"/>
-          <w:numId w:val="19"/>
+          <w:numId w:val="0"/>
         </w:numPr>
-        <w:spacing w:after="200" w:line="276" w:lineRule="auto"/>
-        <w:jc w:val="both"/>
-        <w:rPr>
-          <w:rFonts w:ascii="Times New Roman" w:hAnsi="Times New Roman" w:cs="Times New Roman"/>
-          <w:sz w:val="24"/>
-          <w:szCs w:val="24"/>
-          <w:lang w:val="fr-FR"/>
-        </w:rPr>
-      </w:pPr>
-      <w:r>
-        <w:rPr>
-          <w:rFonts w:ascii="Times New Roman" w:hAnsi="Times New Roman" w:cs="Times New Roman"/>
-          <w:b/>
-          <w:sz w:val="24"/>
-          <w:szCs w:val="24"/>
-          <w:lang w:val="fr-FR"/>
-        </w:rPr>
-        <w:t>Nerf phrénique </w:t>
-      </w:r>
-      <w:r>
-        <w:rPr>
-          <w:rFonts w:ascii="Times New Roman" w:hAnsi="Times New Roman" w:cs="Times New Roman"/>
-          <w:sz w:val="24"/>
-          <w:szCs w:val="24"/>
-          <w:lang w:val="fr-FR"/>
-        </w:rPr>
-        <w:t>:</w:t>
-      </w:r>
-      <w:r>
-        <w:rPr>
-          <w:rFonts w:ascii="Times New Roman" w:hAnsi="Times New Roman" w:cs="Times New Roman"/>
-          <w:b/>
-          <w:color w:val="FF0000"/>
-          <w:sz w:val="24"/>
-          <w:szCs w:val="24"/>
-          <w:lang w:val="fr-FR"/>
-        </w:rPr>
-        <w:t xml:space="preserve"> </w:t>
-      </w:r>
-      <w:r>
-        <w:rPr>
-          <w:rFonts w:ascii="Times New Roman" w:hAnsi="Times New Roman" w:cs="Times New Roman"/>
-          <w:sz w:val="24"/>
-          <w:szCs w:val="24"/>
-          <w:lang w:val="fr-FR"/>
-        </w:rPr>
-        <w:t>C3-C4-C5 et</w:t>
-      </w:r>
-      <w:r>
-        <w:rPr>
-          <w:rFonts w:ascii="Times New Roman" w:hAnsi="Times New Roman" w:cs="Times New Roman"/>
-          <w:b/>
-          <w:color w:val="FF0000"/>
-          <w:sz w:val="24"/>
-          <w:szCs w:val="24"/>
-          <w:lang w:val="fr-FR"/>
-        </w:rPr>
-        <w:t xml:space="preserve"> </w:t>
-      </w:r>
-      <w:r>
-        <w:rPr>
-          <w:rFonts w:ascii="Times New Roman" w:hAnsi="Times New Roman" w:cs="Times New Roman"/>
-          <w:b/>
-          <w:sz w:val="24"/>
-          <w:szCs w:val="24"/>
-          <w:lang w:val="fr-FR"/>
-        </w:rPr>
-        <w:t>Triangle de Sédillot</w:t>
-      </w:r>
-      <w:r>
-        <w:rPr>
-          <w:rFonts w:ascii="Times New Roman" w:hAnsi="Times New Roman" w:cs="Times New Roman"/>
-          <w:sz w:val="24"/>
-          <w:szCs w:val="24"/>
-          <w:lang w:val="fr-FR"/>
-        </w:rPr>
-        <w:t xml:space="preserve">  </w:t>
-      </w:r>
-    </w:p>
-    <w:p>
-      <w:pPr>
-        <w:pStyle w:val="ListParagraph"/>
+        <w:spacing w:after="40"/>
+        <w:ind w:left="360"/>
+        <w:rPr>
+          <w:lang w:val="fr-FR"/>
+        </w:rPr>
+      </w:pPr>
+    </w:p>
+    <w:p>
+      <w:pPr>
+        <w:pStyle w:val="ListBullet"/>
         <w:numPr>
           <w:ilvl w:val="0"/>
-          <w:numId w:val="20"/>
+          <w:numId w:val="0"/>
         </w:numPr>
-        <w:spacing w:after="200" w:line="276" w:lineRule="auto"/>
-        <w:jc w:val="both"/>
-        <w:rPr>
-          <w:rFonts w:ascii="Times New Roman" w:hAnsi="Times New Roman" w:cs="Times New Roman"/>
-          <w:b/>
-          <w:color w:val="FF0000"/>
-          <w:sz w:val="24"/>
-          <w:szCs w:val="24"/>
-          <w:lang w:val="fr-FR"/>
-        </w:rPr>
-      </w:pPr>
-      <w:r>
-        <w:rPr>
-          <w:rFonts w:ascii="Times New Roman" w:hAnsi="Times New Roman" w:cs="Times New Roman"/>
-          <w:b/>
-          <w:sz w:val="24"/>
-          <w:szCs w:val="24"/>
-          <w:lang w:val="fr-FR"/>
-        </w:rPr>
-        <w:t>Syndrome locorégional</w:t>
-      </w:r>
-      <w:r>
-        <w:rPr>
-          <w:rFonts w:ascii="Times New Roman" w:hAnsi="Times New Roman" w:cs="Times New Roman"/>
-          <w:sz w:val="24"/>
-          <w:szCs w:val="24"/>
-          <w:lang w:val="fr-FR"/>
-        </w:rPr>
-        <w:t> : c’est une</w:t>
-      </w:r>
-      <w:r>
-        <w:rPr>
-          <w:rFonts w:ascii="Times New Roman" w:hAnsi="Times New Roman" w:cs="Times New Roman"/>
-          <w:b/>
-          <w:sz w:val="24"/>
-          <w:szCs w:val="24"/>
-          <w:lang w:val="fr-FR"/>
-        </w:rPr>
-        <w:t xml:space="preserve"> </w:t>
-      </w:r>
-      <w:r>
-        <w:rPr>
-          <w:rFonts w:ascii="Times New Roman" w:hAnsi="Times New Roman" w:cs="Times New Roman"/>
-          <w:sz w:val="24"/>
-          <w:szCs w:val="24"/>
-          <w:lang w:val="fr-FR"/>
-        </w:rPr>
-        <w:t xml:space="preserve">compression mécanique locale du système nerveux somatique </w:t>
-      </w:r>
+        <w:spacing w:after="40"/>
+        <w:ind w:left="360"/>
+        <w:rPr>
+          <w:lang w:val="fr-FR"/>
+        </w:rPr>
+      </w:pPr>
       <w:proofErr w:type="gramStart"/>
       <w:r>
         <w:rPr>
-          <w:rFonts w:ascii="Times New Roman" w:hAnsi="Times New Roman" w:cs="Times New Roman"/>
-          <w:sz w:val="24"/>
-          <w:szCs w:val="24"/>
-          <w:lang w:val="fr-FR"/>
-        </w:rPr>
-        <w:t>ou  autonome</w:t>
+          <w:lang w:val="fr-FR"/>
+        </w:rPr>
+        <w:t>les</w:t>
       </w:r>
       <w:proofErr w:type="gramEnd"/>
       <w:r>
         <w:rPr>
-          <w:rFonts w:ascii="Times New Roman" w:hAnsi="Times New Roman" w:cs="Times New Roman"/>
-          <w:sz w:val="24"/>
-          <w:szCs w:val="24"/>
-          <w:lang w:val="fr-FR"/>
-        </w:rPr>
-        <w:t xml:space="preserve"> avec retentissement secondaire général. </w:t>
-      </w:r>
-      <w:r>
-        <w:rPr>
-          <w:rFonts w:ascii="Times New Roman" w:hAnsi="Times New Roman" w:cs="Times New Roman"/>
-          <w:b/>
-          <w:bCs/>
-          <w:sz w:val="24"/>
-          <w:szCs w:val="24"/>
-          <w:lang w:val="fr-FR"/>
-        </w:rPr>
-        <w:t>1ère phase : irritation locale</w:t>
-      </w:r>
-      <w:r>
-        <w:rPr>
-          <w:rFonts w:ascii="Times New Roman" w:hAnsi="Times New Roman" w:cs="Times New Roman"/>
-          <w:sz w:val="24"/>
-          <w:szCs w:val="24"/>
-          <w:lang w:val="fr-FR"/>
-        </w:rPr>
-        <w:t xml:space="preserve"> par emprisonnement d’un nerf. (</w:t>
-      </w:r>
-      <w:proofErr w:type="gramStart"/>
-      <w:r>
-        <w:rPr>
-          <w:rFonts w:ascii="Times New Roman" w:hAnsi="Times New Roman" w:cs="Times New Roman"/>
-          <w:sz w:val="24"/>
-          <w:szCs w:val="24"/>
-          <w:lang w:val="fr-FR"/>
-        </w:rPr>
-        <w:t>ex</w:t>
-      </w:r>
-      <w:proofErr w:type="gramEnd"/>
-      <w:r>
-        <w:rPr>
-          <w:rFonts w:ascii="Times New Roman" w:hAnsi="Times New Roman" w:cs="Times New Roman"/>
-          <w:sz w:val="24"/>
-          <w:szCs w:val="24"/>
-          <w:lang w:val="fr-FR"/>
-        </w:rPr>
-        <w:t xml:space="preserve"> : compression traumatique du ganglion cervical inférieur par blocage C7/D1/1ère côte. Conséquence : facilitation sympathique du territoire d’influence du ganglion cervical inférieur </w:t>
-      </w:r>
-      <w:r>
-        <w:rPr>
-          <w:rFonts w:ascii="Times New Roman" w:hAnsi="Times New Roman" w:cs="Times New Roman"/>
-          <w:b/>
-          <w:color w:val="FF0000"/>
-          <w:sz w:val="24"/>
-          <w:szCs w:val="24"/>
-          <w:lang w:val="fr-FR"/>
-        </w:rPr>
-        <w:t>(Cf. Chapitre 4 Système nerveux autonome)</w:t>
-      </w:r>
-    </w:p>
-    <w:p>
-      <w:pPr>
-        <w:pStyle w:val="ListParagraph"/>
+          <w:lang w:val="fr-FR"/>
+        </w:rPr>
+        <w:t xml:space="preserve"> qualités de palpation peuvent varier selon le niveau de stress et l’état d’adaptation du patient.</w:t>
+      </w:r>
+    </w:p>
+    <w:p>
+      <w:pPr>
+        <w:pStyle w:val="ListBullet"/>
         <w:numPr>
           <w:ilvl w:val="0"/>
-          <w:numId w:val="20"/>
+          <w:numId w:val="0"/>
         </w:numPr>
-        <w:spacing w:after="200" w:line="276" w:lineRule="auto"/>
-        <w:rPr>
-          <w:rFonts w:ascii="Times New Roman" w:hAnsi="Times New Roman" w:cs="Times New Roman"/>
-          <w:sz w:val="24"/>
-          <w:szCs w:val="24"/>
-          <w:lang w:val="fr-FR"/>
-        </w:rPr>
-      </w:pPr>
-      <w:r>
-        <w:rPr>
-          <w:rFonts w:ascii="Times New Roman" w:hAnsi="Times New Roman" w:cs="Times New Roman"/>
-          <w:b/>
-          <w:bCs/>
-          <w:sz w:val="24"/>
-          <w:szCs w:val="24"/>
-          <w:lang w:val="fr-FR"/>
-        </w:rPr>
-        <w:t>2ème phase : inhibition</w:t>
-      </w:r>
-      <w:r>
-        <w:rPr>
-          <w:rFonts w:ascii="Times New Roman" w:hAnsi="Times New Roman" w:cs="Times New Roman"/>
-          <w:sz w:val="24"/>
-          <w:szCs w:val="24"/>
-          <w:lang w:val="fr-FR"/>
-        </w:rPr>
-        <w:t> : si la compression n’est pas levée, le nerf comprimé est considéré comme inhibé. Le système nerveux compensateur est alors libéré d’où, dans l’exemple, syndrome parasympathique par inhibition du système sympathique.</w:t>
-      </w:r>
-      <w:r>
-        <w:rPr>
-          <w:rFonts w:ascii="Times New Roman" w:hAnsi="Times New Roman" w:cs="Times New Roman"/>
-          <w:b/>
-          <w:bCs/>
-          <w:sz w:val="24"/>
-          <w:szCs w:val="24"/>
-          <w:lang w:val="fr-FR"/>
-        </w:rPr>
-        <w:t xml:space="preserve"> </w:t>
-      </w:r>
+        <w:spacing w:after="40"/>
+        <w:ind w:left="360"/>
+        <w:rPr>
+          <w:lang w:val="fr-FR"/>
+        </w:rPr>
+      </w:pPr>
+    </w:p>
+    <w:p>
+      <w:pPr>
+        <w:pStyle w:val="ListBullet"/>
+        <w:numPr>
+          <w:ilvl w:val="0"/>
+          <w:numId w:val="0"/>
+        </w:numPr>
+        <w:spacing w:after="40"/>
+        <w:ind w:left="360"/>
+        <w:rPr>
+          <w:lang w:val="fr-FR"/>
+        </w:rPr>
+      </w:pPr>
+      <w:r>
+        <w:rPr>
+          <w:lang w:val="fr-FR"/>
+        </w:rPr>
+        <w:t>L’objectif n’est pas de commander directement le système autonome, mais d’introduire une information sensorielle apaisante afin de rendre le patient plus disponible pour la suite du traitement, notamment le travail podal.</w:t>
+      </w:r>
+    </w:p>
+    <w:p>
+      <w:pPr>
+        <w:pStyle w:val="ListBullet"/>
+        <w:numPr>
+          <w:ilvl w:val="0"/>
+          <w:numId w:val="0"/>
+        </w:numPr>
+        <w:spacing w:after="40"/>
+        <w:ind w:left="360"/>
+        <w:rPr>
+          <w:lang w:val="fr-FR"/>
+        </w:rPr>
+      </w:pPr>
     </w:p>
     <w:p>
       <w:pPr>
@@ -5804,6 +5869,7 @@
         <w:spacing w:after="40"/>
         <w:ind w:left="360" w:hanging="360"/>
         <w:rPr>
+          <w:color w:val="2F3437"/>
           <w:lang w:val="fr-FR"/>
         </w:rPr>
       </w:pPr>
@@ -5812,11 +5878,13 @@
       <w:pPr>
         <w:spacing w:after="200" w:line="276" w:lineRule="auto"/>
         <w:rPr>
-          <w:lang w:val="fr-FR"/>
-        </w:rPr>
-      </w:pPr>
-      <w:r>
-        <w:rPr>
+          <w:color w:val="2F3437"/>
+          <w:lang w:val="fr-FR"/>
+        </w:rPr>
+      </w:pPr>
+      <w:r>
+        <w:rPr>
+          <w:color w:val="2F3437"/>
           <w:lang w:val="fr-FR"/>
         </w:rPr>
         <w:br w:type="page"/>
@@ -5888,7 +5956,39 @@
           <w:color w:val="2F3437"/>
           <w:sz w:val="18"/>
         </w:rPr>
-        <w:t>2. Bobba-Alves N, Juster RP, Picard M. The energetic cost of allostasis and allostatic load. Psychoneuroendocrinology. 2022;146:105951. doi:10.1016/j.psyneuen.2022.105951.</w:t>
+        <w:t xml:space="preserve">2. Bobba-Alves N, Juster RP, Picard M. The energetic cost of allostasis and allostatic load. Psychoneuroendocrinology. </w:t>
+      </w:r>
+      <w:proofErr w:type="gramStart"/>
+      <w:r>
+        <w:rPr>
+          <w:color w:val="2F3437"/>
+          <w:sz w:val="18"/>
+        </w:rPr>
+        <w:t>2022;146:105951</w:t>
+      </w:r>
+      <w:proofErr w:type="gramEnd"/>
+      <w:r>
+        <w:rPr>
+          <w:color w:val="2F3437"/>
+          <w:sz w:val="18"/>
+        </w:rPr>
+        <w:t xml:space="preserve">. </w:t>
+      </w:r>
+      <w:proofErr w:type="gramStart"/>
+      <w:r>
+        <w:rPr>
+          <w:color w:val="2F3437"/>
+          <w:sz w:val="18"/>
+        </w:rPr>
+        <w:t>doi:10.1016/j.psyneuen</w:t>
+      </w:r>
+      <w:proofErr w:type="gramEnd"/>
+      <w:r>
+        <w:rPr>
+          <w:color w:val="2F3437"/>
+          <w:sz w:val="18"/>
+        </w:rPr>
+        <w:t>.2022.105951.</w:t>
       </w:r>
     </w:p>
     <w:p>
@@ -5902,7 +6002,39 @@
           <w:color w:val="2F3437"/>
           <w:sz w:val="18"/>
         </w:rPr>
-        <w:t>3. Bobba-Alves N, et al. Cellular allostatic load is linked to increased energy expenditure and accelerated biological aging. Psychoneuroendocrinology. 2023;155:106322. doi:10.1016/j.psyneuen.2023.106322.</w:t>
+        <w:t xml:space="preserve">3. Bobba-Alves N, et al. Cellular allostatic load is linked to increased energy expenditure and accelerated biological aging. Psychoneuroendocrinology. </w:t>
+      </w:r>
+      <w:proofErr w:type="gramStart"/>
+      <w:r>
+        <w:rPr>
+          <w:color w:val="2F3437"/>
+          <w:sz w:val="18"/>
+        </w:rPr>
+        <w:t>2023;155:106322</w:t>
+      </w:r>
+      <w:proofErr w:type="gramEnd"/>
+      <w:r>
+        <w:rPr>
+          <w:color w:val="2F3437"/>
+          <w:sz w:val="18"/>
+        </w:rPr>
+        <w:t xml:space="preserve">. </w:t>
+      </w:r>
+      <w:proofErr w:type="gramStart"/>
+      <w:r>
+        <w:rPr>
+          <w:color w:val="2F3437"/>
+          <w:sz w:val="18"/>
+        </w:rPr>
+        <w:t>doi:10.1016/j.psyneuen</w:t>
+      </w:r>
+      <w:proofErr w:type="gramEnd"/>
+      <w:r>
+        <w:rPr>
+          <w:color w:val="2F3437"/>
+          <w:sz w:val="18"/>
+        </w:rPr>
+        <w:t>.2023.106322.</w:t>
       </w:r>
     </w:p>
     <w:p>
@@ -5916,7 +6048,23 @@
           <w:color w:val="2F3437"/>
           <w:sz w:val="18"/>
         </w:rPr>
-        <w:t>4. Picard M, Murugan NJ. The energy resistance principle. Cell Metabolism. 2025;37. doi:10.1016/j.cmet.2025.09.002.</w:t>
+        <w:t xml:space="preserve">4. Picard M, Murugan NJ. The energy resistance principle. Cell Metabolism. 2025;37. </w:t>
+      </w:r>
+      <w:proofErr w:type="gramStart"/>
+      <w:r>
+        <w:rPr>
+          <w:color w:val="2F3437"/>
+          <w:sz w:val="18"/>
+        </w:rPr>
+        <w:t>doi:10.1016/j.cmet</w:t>
+      </w:r>
+      <w:proofErr w:type="gramEnd"/>
+      <w:r>
+        <w:rPr>
+          <w:color w:val="2F3437"/>
+          <w:sz w:val="18"/>
+        </w:rPr>
+        <w:t>.2025.09.002.</w:t>
       </w:r>
     </w:p>
     <w:p>
@@ -5938,7 +6086,23 @@
           <w:color w:val="2F3437"/>
           <w:sz w:val="18"/>
         </w:rPr>
-        <w:t>Changes of cerebral functional connectivity induced by foot reflexology in a randomized controlled trial. Scientific Reports. 2023;13:17139. doi:10.1038/s41598-023-44325-x.</w:t>
+        <w:t xml:space="preserve">Changes of cerebral functional connectivity induced by foot reflexology in a randomized controlled trial. Scientific Reports. </w:t>
+      </w:r>
+      <w:proofErr w:type="gramStart"/>
+      <w:r>
+        <w:rPr>
+          <w:color w:val="2F3437"/>
+          <w:sz w:val="18"/>
+        </w:rPr>
+        <w:t>2023;13:17139</w:t>
+      </w:r>
+      <w:proofErr w:type="gramEnd"/>
+      <w:r>
+        <w:rPr>
+          <w:color w:val="2F3437"/>
+          <w:sz w:val="18"/>
+        </w:rPr>
+        <w:t>. doi:10.1038/s41598-023-44325-x.</w:t>
       </w:r>
     </w:p>
     <w:p>
@@ -5952,7 +6116,23 @@
           <w:color w:val="2F3437"/>
           <w:sz w:val="18"/>
         </w:rPr>
-        <w:t>6. Khalsa SS, et al. Interoception and mental health: a roadmap. Biological Psychiatry: Cognitive Neuroscience and Neuroimaging. 2018;3(6):501-513. doi:10.1016/j.bpsc.2017.12.004.</w:t>
+        <w:t xml:space="preserve">6. Khalsa SS, et al. Interoception and mental health: a roadmap. Biological Psychiatry: Cognitive Neuroscience and Neuroimaging. 2018;3(6):501-513. </w:t>
+      </w:r>
+      <w:proofErr w:type="gramStart"/>
+      <w:r>
+        <w:rPr>
+          <w:color w:val="2F3437"/>
+          <w:sz w:val="18"/>
+        </w:rPr>
+        <w:t>doi:10.1016/j.bpsc</w:t>
+      </w:r>
+      <w:proofErr w:type="gramEnd"/>
+      <w:r>
+        <w:rPr>
+          <w:color w:val="2F3437"/>
+          <w:sz w:val="18"/>
+        </w:rPr>
+        <w:t>.2017.12.004.</w:t>
       </w:r>
     </w:p>
     <w:p>
@@ -6425,7 +6605,15 @@
             </w:tcMar>
           </w:tcPr>
           <w:p>
+            <w:pPr>
+              <w:rPr>
+                <w:lang w:val="fr-FR"/>
+              </w:rPr>
+            </w:pPr>
             <w:r>
+              <w:rPr>
+                <w:lang w:val="fr-FR"/>
+              </w:rPr>
               <w:t>Diminuer la persistance du signal d’alarme et offrir une expérience tactile stable et prévisible.</w:t>
             </w:r>
           </w:p>
@@ -6447,7 +6635,15 @@
             </w:tcMar>
           </w:tcPr>
           <w:p>
+            <w:pPr>
+              <w:rPr>
+                <w:lang w:val="fr-FR"/>
+              </w:rPr>
+            </w:pPr>
             <w:r>
+              <w:rPr>
+                <w:lang w:val="fr-FR"/>
+              </w:rPr>
               <w:t>Zones occipitales ; occiput–C1–C2 ; tronc cérébral ; foramens magnum et jugulaire ; nerfs V, IX, X, XI et XII ; repères du système limbique, du diencéphale et de l’hypophyse.</w:t>
             </w:r>
           </w:p>
@@ -6499,7 +6695,15 @@
             </w:tcMar>
           </w:tcPr>
           <w:p>
+            <w:pPr>
+              <w:rPr>
+                <w:lang w:val="fr-FR"/>
+              </w:rPr>
+            </w:pPr>
             <w:r>
+              <w:rPr>
+                <w:lang w:val="fr-FR"/>
+              </w:rPr>
               <w:t>Accompagner le retrait d’une mobilisation devenue inutile et favoriser une ligne de base autonome plus souple.</w:t>
             </w:r>
           </w:p>
@@ -6522,7 +6726,15 @@
             </w:tcMar>
           </w:tcPr>
           <w:p>
+            <w:pPr>
+              <w:rPr>
+                <w:lang w:val="fr-FR"/>
+              </w:rPr>
+            </w:pPr>
             <w:r>
+              <w:rPr>
+                <w:lang w:val="fr-FR"/>
+              </w:rPr>
               <w:t>Chaînes et ganglions sympathiques ; C7–T1 ; première côte ; colonne thoracique et thoraco-lombaire ; voies parasympathiques ; plexus autonomes ; zones surrénaliennes ; soutiens systémiques selon les tests.</w:t>
             </w:r>
           </w:p>
@@ -6572,7 +6784,15 @@
             </w:tcMar>
           </w:tcPr>
           <w:p>
+            <w:pPr>
+              <w:rPr>
+                <w:lang w:val="fr-FR"/>
+              </w:rPr>
+            </w:pPr>
             <w:r>
+              <w:rPr>
+                <w:lang w:val="fr-FR"/>
+              </w:rPr>
               <w:t>Diminuer les contraintes régionales susceptibles d’entretenir le signal et restaurer une meilleure disponibilité mécanique, respiratoire et viscérale.</w:t>
             </w:r>
           </w:p>
@@ -6594,7 +6814,15 @@
             </w:tcMar>
           </w:tcPr>
           <w:p>
+            <w:pPr>
+              <w:rPr>
+                <w:lang w:val="fr-FR"/>
+              </w:rPr>
+            </w:pPr>
             <w:r>
+              <w:rPr>
+                <w:lang w:val="fr-FR"/>
+              </w:rPr>
               <w:t>Nerf phrénique C3–C5 ; diaphragme, piliers et hiatus ; péritoine ; mésos ; fascias ; ligaments ; plexus abdominaux ou pelviens ; périnée et passages neurovasculaires.</w:t>
             </w:r>
           </w:p>
@@ -6623,7 +6851,15 @@
             </w:tcMar>
           </w:tcPr>
           <w:p>
+            <w:pPr>
+              <w:rPr>
+                <w:lang w:val="fr-FR"/>
+              </w:rPr>
+            </w:pPr>
             <w:r>
+              <w:rPr>
+                <w:lang w:val="fr-FR"/>
+              </w:rPr>
               <w:t>4. Cible viscérale ou fonctionnelle spécifique</w:t>
             </w:r>
           </w:p>
@@ -6646,7 +6882,15 @@
             </w:tcMar>
           </w:tcPr>
           <w:p>
+            <w:pPr>
+              <w:rPr>
+                <w:lang w:val="fr-FR"/>
+              </w:rPr>
+            </w:pPr>
             <w:r>
+              <w:rPr>
+                <w:lang w:val="fr-FR"/>
+              </w:rPr>
               <w:t>Créer un contexte autonome et régional plus favorable au retour de la fonction concernée.</w:t>
             </w:r>
           </w:p>
@@ -6669,7 +6913,15 @@
             </w:tcMar>
           </w:tcPr>
           <w:p>
+            <w:pPr>
+              <w:rPr>
+                <w:lang w:val="fr-FR"/>
+              </w:rPr>
+            </w:pPr>
             <w:r>
+              <w:rPr>
+                <w:lang w:val="fr-FR"/>
+              </w:rPr>
               <w:t>Voies autonomes et plexus du territoire ; système nerveux entérique ; plexus hypogastriques ; parasympathique pelvien S2–S4 ; zones réflexes de l’organe ou de la fonction ciblée.</w:t>
             </w:r>
           </w:p>
@@ -9350,7 +9602,6 @@
   <w:style w:type="character" w:default="1" w:styleId="DefaultParagraphFont">
     <w:name w:val="Default Paragraph Font"/>
     <w:uiPriority w:val="1"/>
-    <w:semiHidden/>
     <w:unhideWhenUsed/>
   </w:style>
   <w:style w:type="table" w:default="1" w:styleId="TableNormal">

</xml_diff>